<commit_message>
Remove optional launch files and simplify submission
</commit_message>
<xml_diff>
--- a/report/Assignment_2_Report.docx
+++ b/report/Assignment_2_Report.docx
@@ -306,7 +306,7 @@
     </w:p>
     <w:p>
       <w:r>
-        <w:t>IntList is a small interface: a shared list of methods for the two list classes. It lets the same test code work with either class. Metrics stores three counters: accesses, comparisons, and movements. Demo.java shows small examples before the larger tests.</w:t>
+        <w:t>IntList is a small interface: a shared list of methods for the two list classes. It lets the same test code work with either class. Metrics stores three counters: accesses, comparisons, and movements.</w:t>
       </w:r>
     </w:p>
     <w:p>
@@ -329,7 +329,7 @@
     </w:p>
     <w:p>
       <w:r>
-        <w:t>Array results are compared with ArrayList; list results with java.util.LinkedList; heap results with PriorityQueue and a sorted array. Mixed heap tests check the heap rule after every insertion and removal. The latest run passed 188,698 checks. Its output is saved in results/test-results.txt [3].</w:t>
+        <w:t>Array results are compared with ArrayList; list results with java.util.LinkedList; heap results with PriorityQueue and a sorted array. Mixed heap tests check the heap rule after every insertion and removal. The latest run passed 188,698 checks [3].</w:t>
       </w:r>
     </w:p>
     <w:p>
@@ -2889,7 +2889,7 @@
     </w:p>
     <w:p>
       <w:r>
-        <w:t>A batch includes one prepared structure. All insertions start from a separate original structure. Measurements were made in a shared Linux container with OpenJDK 21, not on the student's computer. Full version and memory details are in results/environment.txt. Times may vary because of Java warm-up, scheduling, and memory use [3].</w:t>
+        <w:t>A batch includes one prepared structure. All insertions start from a separate original structure. Measurements were made in a shared Linux container with OpenJDK 21, not on the student's computer. Times may vary because of Java warm-up, scheduling, and memory use [3].</w:t>
       </w:r>
     </w:p>
     <w:p>
@@ -10328,7 +10328,7 @@
     </w:p>
     <w:p>
       <w:r>
-        <w:t>Counts are identical across the five runs because the input is fixed. verify_results.py checks averages, repeat counts, search hits, and exact insertion/removal counts. These checks passed for all 56 experiments [3].</w:t>
+        <w:t>Counts are identical across the five runs because the input is fixed. The saved CSV files contain five runs for each of the 56 experiments [3].</w:t>
       </w:r>
     </w:p>
     <w:p>
@@ -10878,41 +10878,22 @@
     </w:p>
     <w:p>
       <w:r>
-        <w:t>On Windows, run check.bat first. It compiles the source, runs Demo, and runs Tests. It does not replace the saved measurements. A JDK is needed; this project was tested with JDK 21. On macOS/Linux use sh check.sh.</w:t>
+        <w:t>Install a JDK (tested with Java 21). In the project folder run javac -d out src/*.java, then java -cp out Tests. On Windows Command Prompt, use javac -d out src\*.java. For new measurements run java -cp out Benchmark. This replaces the saved CSV files, so keep a copy of the original results and plots.</w:t>
       </w:r>
     </w:p>
     <w:p>
       <w:r>
-        <w:t>run.bat or sh run.sh starts the full benchmark and replaces the result CSV files. Run it in a copy of the project to keep the supplied results unchanged. To rebuild all graphs and documents after new measurements, use the optional Python scripts:</w:t>
-      </w:r>
-    </w:p>
-    <w:p>
-      <w:pPr>
-        <w:keepLines/>
-        <w:spacing w:line="240" w:lineRule="auto"/>
-      </w:pPr>
-      <w:r>
-        <w:rPr>
-          <w:rFonts w:ascii="Liberation Mono" w:hAnsi="Liberation Mono"/>
-          <w:sz w:val="18"/>
-        </w:rPr>
-        <w:t>python -m pip install matplotlib python-docx</w:t>
-        <w:br/>
-        <w:t>python scripts/verify_results.py</w:t>
-        <w:br/>
-        <w:t>python scripts/make_plots.py</w:t>
-        <w:br/>
-        <w:t>python scripts/build_report.py</w:t>
+        <w:t>The assignment requires a GitHub link, the report, benchmark tables, and plots. Add your name and group before submitting.</w:t>
       </w:r>
     </w:p>
     <w:p>
       <w:r>
-        <w:t>The brief asks for tables, graphs, an individual report, and a GitHub repository link. It does not separately require screenshots [1]. A screenshot of your own successful test run can be added as extra evidence, but it does not replace the source files or results.</w:t>
+        <w:t>The brief does not separately require screenshots [1]. The source and results are the required evidence.</w:t>
       </w:r>
     </w:p>
     <w:p>
       <w:r>
-        <w:t>The ZIP includes the existing local development history and the actual simplification changes. These assistant-prepared commits are not past work done by the student. Publish honestly under your authorized account; see docs/PUBLISHING.md. Review the code and fill in the name and group before submission.</w:t>
+        <w:t>The included local Git history contains assistant-prepared commits. A GitHub repository still needs to be published under your own account. Describe your contribution accurately.</w:t>
       </w:r>
     </w:p>
     <w:p>
@@ -10935,7 +10916,7 @@
     </w:p>
     <w:p>
       <w:r>
-        <w:t>[3] This project: src/*.java, results/tables/raw.csv, summary.csv, test-results.txt, benchmark-log.txt, verification.txt, and environment.txt. Source of the tests, measurements, and checks. Proofs and workload explanations follow the supplied code.</w:t>
+        <w:t>[3] This project: src/*.java and results/tables/raw.csv and summary.csv. Source of the tests, measurements, and checks. Proofs and workload explanations follow the supplied code.</w:t>
       </w:r>
     </w:p>
     <w:sectPr>

</xml_diff>